<commit_message>
Update demo/testing video link in project documentation
Co-authored-by: arena-agent <297053741+arena-agent@users.noreply.github.com>
</commit_message>
<xml_diff>
--- a/ComicCraft_Phase_Wise_Submission/07_Project_Documentation/07_Final_Project_Report.docx
+++ b/ComicCraft_Phase_Wise_Submission/07_Project_Documentation/07_Final_Project_Report.docx
@@ -5831,7 +5831,7 @@
         <w:fldChar w:fldCharType="begin"/>
       </w:r>
       <w:r>
-        <w:instrText>HYPERLINK "https://drive.google.com/file/d/1Vgp7bjWOtR8eGUQdYQYegWc1Z56Xzlig/view?usp=drivesdk"</w:instrText>
+        <w:instrText>HYPERLINK "https://drive.google.com/file/d/1JU2JsKmHUZworPi4Qlxv7zvojVqCDJ3O/view?usp=drivesdk"</w:instrText>
       </w:r>
       <w:r>
         <w:rPr>
@@ -5845,7 +5845,7 @@
         <w:rPr>
           <w:rStyle w:val="97"/>
         </w:rPr>
-        <w:t>https://drive.google.com/file/d/1Vgp7bjWOtR8eGUQdYQYegWc1Z56Xzlig/view?usp=drivesdk</w:t>
+        <w:t>https://drive.google.com/file/d/1JU2JsKmHUZworPi4Qlxv7zvojVqCDJ3O/view?usp=drivesdk</w:t>
       </w:r>
       <w:r>
         <w:rPr>

</xml_diff>